<commit_message>
Sync application demo proof updates
</commit_message>
<xml_diff>
--- a/public/documents/resume/JONATHAN_YU_SIP_STUDIES_COMBINED_RESUME_V4_CRITICAL_ON_HAND_2026-06-02.docx
+++ b/public/documents/resume/JONATHAN_YU_SIP_STUDIES_COMBINED_RESUME_V4_CRITICAL_ON_HAND_2026-06-02.docx
@@ -187,7 +187,7 @@
       <w:pPr/>
       <w:r>
         <w:rPr/>
-        <w:t xml:space="preserve">Beverage educator and founder-builder combining 10+ years in wine and spirits sales, account analytics, formal credentials, architecture/design training, live-event production, and AI-enabled education technology. Built Sip Studies as a full-stack beverage learning platform and maintains weekly Critical On Hand gap-analysis workflows for POD gaps, inventory movement, sales velocity, incentives, and account opportunities.</w:t>
+        <w:t xml:space="preserve">Beverage educator and founder-builder combining 10+ years in wine and spirits sales, account analytics, formal credentials, architecture/design training, live-event production, and AI-enabled education technology. Since 2022, has used OpenAI products to turn a nontraditional coding background into repo-driven product development, documentation, media, and design execution.</w:t>
       </w:r>
     </w:p>
     <w:p>
@@ -325,127 +325,55 @@
       </w:pPr>
       <w:r>
         <w:rPr/>
-        <w:t xml:space="preserve">Beverage education + curriculum</w:t>
-      </w:r>
-    </w:p>
-    <w:p>
-      <w:pPr>
-        <w:numPr>
-          <w:ilvl w:val="0"/>
-          <w:numId w:val="1"/>
-        </w:numPr>
-      </w:pPr>
-      <w:r>
-        <w:rPr/>
-        <w:t xml:space="preserve">Wine, spirits, beer + hospitality sales</w:t>
-      </w:r>
-    </w:p>
-    <w:p>
-      <w:pPr>
-        <w:numPr>
-          <w:ilvl w:val="0"/>
-          <w:numId w:val="1"/>
-        </w:numPr>
-      </w:pPr>
-      <w:r>
-        <w:rPr/>
-        <w:t xml:space="preserve">AI beverage/content systems</w:t>
-      </w:r>
-    </w:p>
-    <w:p>
-      <w:pPr>
-        <w:numPr>
-          <w:ilvl w:val="0"/>
-          <w:numId w:val="1"/>
-        </w:numPr>
-      </w:pPr>
-      <w:r>
-        <w:rPr/>
-        <w:t xml:space="preserve">React, TypeScript, Vite</w:t>
-      </w:r>
-    </w:p>
-    <w:p>
-      <w:pPr>
-        <w:numPr>
-          <w:ilvl w:val="0"/>
-          <w:numId w:val="1"/>
-        </w:numPr>
-      </w:pPr>
-      <w:r>
-        <w:rPr/>
-        <w:t xml:space="preserve">Supabase, Stripe, Edge Functions</w:t>
-      </w:r>
-    </w:p>
-    <w:p>
-      <w:pPr>
-        <w:numPr>
-          <w:ilvl w:val="0"/>
-          <w:numId w:val="1"/>
-        </w:numPr>
-      </w:pPr>
-      <w:r>
-        <w:rPr/>
-        <w:t xml:space="preserve">Distributor + supplier enablement</w:t>
-      </w:r>
-    </w:p>
-    <w:p>
-      <w:pPr>
-        <w:numPr>
-          <w:ilvl w:val="0"/>
-          <w:numId w:val="1"/>
-        </w:numPr>
-      </w:pPr>
-      <w:r>
-        <w:rPr/>
-        <w:t xml:space="preserve">Live stream + VIP event operations</w:t>
-      </w:r>
-    </w:p>
-    <w:p>
-      <w:pPr>
-        <w:numPr>
-          <w:ilvl w:val="0"/>
-          <w:numId w:val="1"/>
-        </w:numPr>
-      </w:pPr>
-      <w:r>
-        <w:rPr/>
-        <w:t xml:space="preserve">Architecture, AutoCAD + 3D modeling</w:t>
-      </w:r>
-    </w:p>
-    <w:p>
-      <w:pPr>
-        <w:numPr>
-          <w:ilvl w:val="0"/>
-          <w:numId w:val="1"/>
-        </w:numPr>
-      </w:pPr>
-      <w:r>
-        <w:rPr/>
-        <w:t xml:space="preserve">Visual design + brand systems</w:t>
-      </w:r>
-    </w:p>
-    <w:p>
-      <w:pPr>
-        <w:numPr>
-          <w:ilvl w:val="0"/>
-          <w:numId w:val="1"/>
-        </w:numPr>
-      </w:pPr>
-      <w:r>
-        <w:rPr/>
-        <w:t xml:space="preserve">POD gap analysis + inventory movement</w:t>
-      </w:r>
-    </w:p>
-    <w:p>
-      <w:pPr>
-        <w:numPr>
-          <w:ilvl w:val="0"/>
-          <w:numId w:val="1"/>
-        </w:numPr>
-      </w:pPr>
-      <w:r>
-        <w:rPr/>
-        <w:t xml:space="preserve">Data preservation + terminology</w:t>
+        <w:t xml:space="preserve">AI/Product: advanced prompting, durable goals/threads, repo-driven AI agents, Codex-assisted project development, OpenAI product fluency since 2022</w:t>
+      </w:r>
+    </w:p>
+    <w:p>
+      <w:pPr>
+        <w:numPr>
+          <w:ilvl w:val="0"/>
+          <w:numId w:val="1"/>
+        </w:numPr>
+      </w:pPr>
+      <w:r>
+        <w:rPr/>
+        <w:t xml:space="preserve">OpenAI tools: ChatGPT, DALL-E, custom GPTs/GPT Store, Sora, Codex, image-generation workflows</w:t>
+      </w:r>
+    </w:p>
+    <w:p>
+      <w:pPr>
+        <w:numPr>
+          <w:ilvl w:val="0"/>
+          <w:numId w:val="1"/>
+        </w:numPr>
+      </w:pPr>
+      <w:r>
+        <w:rPr/>
+        <w:t xml:space="preserve">Customer Enablement: workshops, training, curriculum, adoption planning, stakeholder communication</w:t>
+      </w:r>
+    </w:p>
+    <w:p>
+      <w:pPr>
+        <w:numPr>
+          <w:ilvl w:val="0"/>
+          <w:numId w:val="1"/>
+        </w:numPr>
+      </w:pPr>
+      <w:r>
+        <w:rPr/>
+        <w:t xml:space="preserve">Analytics/Ops: POD gap analysis, inventory movement, sales velocity, account prioritization</w:t>
+      </w:r>
+    </w:p>
+    <w:p>
+      <w:pPr>
+        <w:numPr>
+          <w:ilvl w:val="0"/>
+          <w:numId w:val="1"/>
+        </w:numPr>
+      </w:pPr>
+      <w:r>
+        <w:rPr/>
+        <w:t xml:space="preserve">Beverage: wine/spirits education, supplier enablement, formal credentials</w:t>
       </w:r>
     </w:p>
     <w:p>
@@ -659,7 +587,7 @@
       </w:pPr>
       <w:r>
         <w:rPr/>
-        <w:t xml:space="preserve">Built a React/TypeScript, Vite, Supabase, Stripe, and Edge Function workspace across Learn, Taste, and Connect: Sip Academy, Sipopedia, Beverage Quiz, Maps, Flavor Wheel, Tasting Journal, Beverage News, AI Winecast, and Somm Events.</w:t>
+        <w:t xml:space="preserve">Using AI-assisted, repo-driven workflows, built a React/TypeScript, Vite, Supabase, Stripe, and Edge Function workspace across Learn, Taste, and Connect: Sip Academy, Sipopedia, Beverage Quiz, Maps, Flavor Wheel, Tasting Journal, Beverage News, AI Winecast, and Somm Events.</w:t>
       </w:r>
     </w:p>
     <w:p>

</xml_diff>